<commit_message>
Mac run guide and double-click start/stop scripts (live, offline, local+Atlas)
Co-Authored-By: Claude Opus 5.5 <noreply@anthropic.com>
</commit_message>
<xml_diff>
--- a/VIVA_DOCUMENT.docx
+++ b/VIVA_DOCUMENT.docx
@@ -1994,36 +1994,45 @@
     </w:p>
     <w:p>
       <w:pPr>
-        <w:pStyle w:val="ListParagraph"/>
-        <w:numPr>
-          <w:ilvl w:val="0"/>
-          <w:numId w:val="3"/>
-        </w:numPr>
-      </w:pPr>
+        <w:tabs>
+          <w:tab w:val="left" w:pos="540"/>
+        </w:tabs>
+        <w:spacing w:after="60"/>
+        <w:ind w:left="540" w:hanging="300"/>
+      </w:pPr>
+      <w:r>
+        <w:t xml:space="preserve">1.	</w:t>
+      </w:r>
       <w:r>
         <w:t xml:space="preserve">Open https://canteen-preorder-six.vercel.app, log in as student, place one test order, log out. This confirms everything works.</w:t>
       </w:r>
     </w:p>
     <w:p>
       <w:pPr>
-        <w:pStyle w:val="ListParagraph"/>
-        <w:numPr>
-          <w:ilvl w:val="0"/>
-          <w:numId w:val="3"/>
-        </w:numPr>
-      </w:pPr>
+        <w:tabs>
+          <w:tab w:val="left" w:pos="540"/>
+        </w:tabs>
+        <w:spacing w:after="60"/>
+        <w:ind w:left="540" w:hanging="300"/>
+      </w:pPr>
+      <w:r>
+        <w:t xml:space="preserve">2.	</w:t>
+      </w:r>
       <w:r>
         <w:t xml:space="preserve">Charge the laptop. Keep this document and the GitHub page bookmarked.</w:t>
       </w:r>
     </w:p>
     <w:p>
       <w:pPr>
-        <w:pStyle w:val="ListParagraph"/>
-        <w:numPr>
-          <w:ilvl w:val="0"/>
-          <w:numId w:val="3"/>
-        </w:numPr>
-      </w:pPr>
+        <w:tabs>
+          <w:tab w:val="left" w:pos="540"/>
+        </w:tabs>
+        <w:spacing w:after="60"/>
+        <w:ind w:left="540" w:hanging="300"/>
+      </w:pPr>
+      <w:r>
+        <w:t xml:space="preserve">3.	</w:t>
+      </w:r>
       <w:r>
         <w:t xml:space="preserve">Make sure the offline mode works once (see §6), in case Wi-Fi fails tomorrow.</w:t>
       </w:r>
@@ -2042,12 +2051,15 @@
     </w:p>
     <w:p>
       <w:pPr>
-        <w:pStyle w:val="ListParagraph"/>
-        <w:numPr>
-          <w:ilvl w:val="0"/>
-          <w:numId w:val="4"/>
-        </w:numPr>
-      </w:pPr>
+        <w:tabs>
+          <w:tab w:val="left" w:pos="540"/>
+        </w:tabs>
+        <w:spacing w:after="60"/>
+        <w:ind w:left="540" w:hanging="300"/>
+      </w:pPr>
+      <w:r>
+        <w:t xml:space="preserve">1.	</w:t>
+      </w:r>
       <w:r>
         <w:t xml:space="preserve">Open https://canteen-api-v1ga.onrender.com/health and wait until it shows </w:t>
       </w:r>
@@ -2076,36 +2088,45 @@
     </w:p>
     <w:p>
       <w:pPr>
-        <w:pStyle w:val="ListParagraph"/>
-        <w:numPr>
-          <w:ilvl w:val="0"/>
-          <w:numId w:val="4"/>
-        </w:numPr>
-      </w:pPr>
+        <w:tabs>
+          <w:tab w:val="left" w:pos="540"/>
+        </w:tabs>
+        <w:spacing w:after="60"/>
+        <w:ind w:left="540" w:hanging="300"/>
+      </w:pPr>
+      <w:r>
+        <w:t xml:space="preserve">2.	</w:t>
+      </w:r>
       <w:r>
         <w:t xml:space="preserve">Open the live website in one tab and keep it on the Login page.</w:t>
       </w:r>
     </w:p>
     <w:p>
       <w:pPr>
-        <w:pStyle w:val="ListParagraph"/>
-        <w:numPr>
-          <w:ilvl w:val="0"/>
-          <w:numId w:val="4"/>
-        </w:numPr>
-      </w:pPr>
+        <w:tabs>
+          <w:tab w:val="left" w:pos="540"/>
+        </w:tabs>
+        <w:spacing w:after="60"/>
+        <w:ind w:left="540" w:hanging="300"/>
+      </w:pPr>
+      <w:r>
+        <w:t xml:space="preserve">3.	</w:t>
+      </w:r>
       <w:r>
         <w:t xml:space="preserve">Optionally open in other tabs: the GitHub repo, the code in VS Code, MongoDB Atlas → Browse Collections, and Postman with the collection imported.</w:t>
       </w:r>
     </w:p>
     <w:p>
       <w:pPr>
-        <w:pStyle w:val="ListParagraph"/>
-        <w:numPr>
-          <w:ilvl w:val="0"/>
-          <w:numId w:val="4"/>
-        </w:numPr>
-      </w:pPr>
+        <w:tabs>
+          <w:tab w:val="left" w:pos="540"/>
+        </w:tabs>
+        <w:spacing w:after="60"/>
+        <w:ind w:left="540" w:hanging="300"/>
+      </w:pPr>
+      <w:r>
+        <w:t xml:space="preserve">4.	</w:t>
+      </w:r>
       <w:r>
         <w:t xml:space="preserve">If you are demoing for longer than 15 minutes with breaks, refresh /health again just before showing the site.</w:t>
       </w:r>
@@ -7348,12 +7369,15 @@
     </w:p>
     <w:p>
       <w:pPr>
-        <w:pStyle w:val="ListParagraph"/>
-        <w:numPr>
-          <w:ilvl w:val="0"/>
-          <w:numId w:val="5"/>
-        </w:numPr>
-      </w:pPr>
+        <w:tabs>
+          <w:tab w:val="left" w:pos="540"/>
+        </w:tabs>
+        <w:spacing w:after="60"/>
+        <w:ind w:left="540" w:hanging="300"/>
+      </w:pPr>
+      <w:r>
+        <w:t xml:space="preserve">1.	</w:t>
+      </w:r>
       <w:r>
         <w:t xml:space="preserve">React (</w:t>
       </w:r>
@@ -7396,12 +7420,15 @@
     </w:p>
     <w:p>
       <w:pPr>
-        <w:pStyle w:val="ListParagraph"/>
-        <w:numPr>
-          <w:ilvl w:val="0"/>
-          <w:numId w:val="5"/>
-        </w:numPr>
-      </w:pPr>
+        <w:tabs>
+          <w:tab w:val="left" w:pos="540"/>
+        </w:tabs>
+        <w:spacing w:after="60"/>
+        <w:ind w:left="540" w:hanging="300"/>
+      </w:pPr>
+      <w:r>
+        <w:t xml:space="preserve">2.	</w:t>
+      </w:r>
       <w:r>
         <w:rPr>
           <w:rFonts w:ascii="Consolas" w:cs="Consolas" w:eastAsia="Consolas" w:hAnsi="Consolas"/>
@@ -7447,12 +7474,15 @@
     </w:p>
     <w:p>
       <w:pPr>
-        <w:pStyle w:val="ListParagraph"/>
-        <w:numPr>
-          <w:ilvl w:val="0"/>
-          <w:numId w:val="5"/>
-        </w:numPr>
-      </w:pPr>
+        <w:tabs>
+          <w:tab w:val="left" w:pos="540"/>
+        </w:tabs>
+        <w:spacing w:after="60"/>
+        <w:ind w:left="540" w:hanging="300"/>
+      </w:pPr>
+      <w:r>
+        <w:t xml:space="preserve">3.	</w:t>
+      </w:r>
       <w:r>
         <w:rPr>
           <w:rFonts w:ascii="Consolas" w:cs="Consolas" w:eastAsia="Consolas" w:hAnsi="Consolas"/>
@@ -7468,12 +7498,15 @@
     </w:p>
     <w:p>
       <w:pPr>
-        <w:pStyle w:val="ListParagraph"/>
-        <w:numPr>
-          <w:ilvl w:val="0"/>
-          <w:numId w:val="5"/>
-        </w:numPr>
-      </w:pPr>
+        <w:tabs>
+          <w:tab w:val="left" w:pos="540"/>
+        </w:tabs>
+        <w:spacing w:after="60"/>
+        <w:ind w:left="540" w:hanging="300"/>
+      </w:pPr>
+      <w:r>
+        <w:t xml:space="preserve">4.	</w:t>
+      </w:r>
       <w:r>
         <w:rPr>
           <w:rFonts w:ascii="Consolas" w:cs="Consolas" w:eastAsia="Consolas" w:hAnsi="Consolas"/>
@@ -7501,12 +7534,15 @@
     </w:p>
     <w:p>
       <w:pPr>
-        <w:pStyle w:val="ListParagraph"/>
-        <w:numPr>
-          <w:ilvl w:val="0"/>
-          <w:numId w:val="5"/>
-        </w:numPr>
-      </w:pPr>
+        <w:tabs>
+          <w:tab w:val="left" w:pos="540"/>
+        </w:tabs>
+        <w:spacing w:after="60"/>
+        <w:ind w:left="540" w:hanging="300"/>
+      </w:pPr>
+      <w:r>
+        <w:t xml:space="preserve">5.	</w:t>
+      </w:r>
       <w:r>
         <w:rPr>
           <w:rFonts w:ascii="Consolas" w:cs="Consolas" w:eastAsia="Consolas" w:hAnsi="Consolas"/>
@@ -7522,12 +7558,15 @@
     </w:p>
     <w:p>
       <w:pPr>
-        <w:pStyle w:val="ListParagraph"/>
-        <w:numPr>
-          <w:ilvl w:val="0"/>
-          <w:numId w:val="5"/>
-        </w:numPr>
-      </w:pPr>
+        <w:tabs>
+          <w:tab w:val="left" w:pos="540"/>
+        </w:tabs>
+        <w:spacing w:after="60"/>
+        <w:ind w:left="540" w:hanging="300"/>
+      </w:pPr>
+      <w:r>
+        <w:t xml:space="preserve">6.	</w:t>
+      </w:r>
       <w:r>
         <w:rPr>
           <w:rFonts w:ascii="Consolas" w:cs="Consolas" w:eastAsia="Consolas" w:hAnsi="Consolas"/>
@@ -7543,12 +7582,15 @@
     </w:p>
     <w:p>
       <w:pPr>
-        <w:pStyle w:val="ListParagraph"/>
-        <w:numPr>
-          <w:ilvl w:val="0"/>
-          <w:numId w:val="5"/>
-        </w:numPr>
-      </w:pPr>
+        <w:tabs>
+          <w:tab w:val="left" w:pos="540"/>
+        </w:tabs>
+        <w:spacing w:after="60"/>
+        <w:ind w:left="540" w:hanging="300"/>
+      </w:pPr>
+      <w:r>
+        <w:t xml:space="preserve">7.	</w:t>
+      </w:r>
       <w:r>
         <w:rPr>
           <w:rFonts w:ascii="Consolas" w:cs="Consolas" w:eastAsia="Consolas" w:hAnsi="Consolas"/>
@@ -7564,12 +7606,15 @@
     </w:p>
     <w:p>
       <w:pPr>
-        <w:pStyle w:val="ListParagraph"/>
-        <w:numPr>
-          <w:ilvl w:val="0"/>
-          <w:numId w:val="5"/>
-        </w:numPr>
-      </w:pPr>
+        <w:tabs>
+          <w:tab w:val="left" w:pos="540"/>
+        </w:tabs>
+        <w:spacing w:after="60"/>
+        <w:ind w:left="540" w:hanging="300"/>
+      </w:pPr>
+      <w:r>
+        <w:t xml:space="preserve">8.	</w:t>
+      </w:r>
       <w:r>
         <w:t xml:space="preserve">Any error thrown goes to </w:t>
       </w:r>
@@ -7588,12 +7633,15 @@
     </w:p>
     <w:p>
       <w:pPr>
-        <w:pStyle w:val="ListParagraph"/>
-        <w:numPr>
-          <w:ilvl w:val="0"/>
-          <w:numId w:val="5"/>
-        </w:numPr>
-      </w:pPr>
+        <w:tabs>
+          <w:tab w:val="left" w:pos="540"/>
+        </w:tabs>
+        <w:spacing w:after="60"/>
+        <w:ind w:left="540" w:hanging="300"/>
+      </w:pPr>
+      <w:r>
+        <w:t xml:space="preserve">9.	</w:t>
+      </w:r>
       <w:r>
         <w:t xml:space="preserve">React shows the order details page or the error message.</w:t>
       </w:r>
@@ -16116,12 +16164,15 @@
     </w:p>
     <w:p>
       <w:pPr>
-        <w:pStyle w:val="ListParagraph"/>
-        <w:numPr>
-          <w:ilvl w:val="0"/>
-          <w:numId w:val="6"/>
-        </w:numPr>
-      </w:pPr>
+        <w:tabs>
+          <w:tab w:val="left" w:pos="540"/>
+        </w:tabs>
+        <w:spacing w:after="60"/>
+        <w:ind w:left="540" w:hanging="300"/>
+      </w:pPr>
+      <w:r>
+        <w:t xml:space="preserve">1.	</w:t>
+      </w:r>
       <w:r>
         <w:rPr>
           <w:b/>
@@ -16157,12 +16208,15 @@
     </w:p>
     <w:p>
       <w:pPr>
-        <w:pStyle w:val="ListParagraph"/>
-        <w:numPr>
-          <w:ilvl w:val="0"/>
-          <w:numId w:val="6"/>
-        </w:numPr>
-      </w:pPr>
+        <w:tabs>
+          <w:tab w:val="left" w:pos="540"/>
+        </w:tabs>
+        <w:spacing w:after="60"/>
+        <w:ind w:left="540" w:hanging="300"/>
+      </w:pPr>
+      <w:r>
+        <w:t xml:space="preserve">2.	</w:t>
+      </w:r>
       <w:r>
         <w:rPr>
           <w:b/>
@@ -16246,12 +16300,15 @@
     </w:p>
     <w:p>
       <w:pPr>
-        <w:pStyle w:val="ListParagraph"/>
-        <w:numPr>
-          <w:ilvl w:val="0"/>
-          <w:numId w:val="6"/>
-        </w:numPr>
-      </w:pPr>
+        <w:tabs>
+          <w:tab w:val="left" w:pos="540"/>
+        </w:tabs>
+        <w:spacing w:after="60"/>
+        <w:ind w:left="540" w:hanging="300"/>
+      </w:pPr>
+      <w:r>
+        <w:t xml:space="preserve">3.	</w:t>
+      </w:r>
       <w:r>
         <w:rPr>
           <w:b/>
@@ -16311,12 +16368,15 @@
     </w:p>
     <w:p>
       <w:pPr>
-        <w:pStyle w:val="ListParagraph"/>
-        <w:numPr>
-          <w:ilvl w:val="0"/>
-          <w:numId w:val="6"/>
-        </w:numPr>
-      </w:pPr>
+        <w:tabs>
+          <w:tab w:val="left" w:pos="540"/>
+        </w:tabs>
+        <w:spacing w:after="60"/>
+        <w:ind w:left="540" w:hanging="300"/>
+      </w:pPr>
+      <w:r>
+        <w:t xml:space="preserve">4.	</w:t>
+      </w:r>
       <w:r>
         <w:rPr>
           <w:b/>
@@ -16903,12 +16963,15 @@
     </w:p>
     <w:p>
       <w:pPr>
-        <w:pStyle w:val="ListParagraph"/>
-        <w:numPr>
-          <w:ilvl w:val="0"/>
-          <w:numId w:val="7"/>
-        </w:numPr>
-      </w:pPr>
+        <w:tabs>
+          <w:tab w:val="left" w:pos="540"/>
+        </w:tabs>
+        <w:spacing w:after="60"/>
+        <w:ind w:left="540" w:hanging="300"/>
+      </w:pPr>
+      <w:r>
+        <w:t xml:space="preserve">1.	</w:t>
+      </w:r>
       <w:r>
         <w:rPr>
           <w:rFonts w:ascii="Consolas" w:cs="Consolas" w:eastAsia="Consolas" w:hAnsi="Consolas"/>
@@ -16960,12 +17023,15 @@
     </w:p>
     <w:p>
       <w:pPr>
-        <w:pStyle w:val="ListParagraph"/>
-        <w:numPr>
-          <w:ilvl w:val="0"/>
-          <w:numId w:val="7"/>
-        </w:numPr>
-      </w:pPr>
+        <w:tabs>
+          <w:tab w:val="left" w:pos="540"/>
+        </w:tabs>
+        <w:spacing w:after="60"/>
+        <w:ind w:left="540" w:hanging="300"/>
+      </w:pPr>
+      <w:r>
+        <w:t xml:space="preserve">2.	</w:t>
+      </w:r>
       <w:r>
         <w:t xml:space="preserve">Slot must exist and be active (else 404) and </w:t>
       </w:r>
@@ -17018,12 +17084,15 @@
     </w:p>
     <w:p>
       <w:pPr>
-        <w:pStyle w:val="ListParagraph"/>
-        <w:numPr>
-          <w:ilvl w:val="0"/>
-          <w:numId w:val="7"/>
-        </w:numPr>
-      </w:pPr>
+        <w:tabs>
+          <w:tab w:val="left" w:pos="540"/>
+        </w:tabs>
+        <w:spacing w:after="60"/>
+        <w:ind w:left="540" w:hanging="300"/>
+      </w:pPr>
+      <w:r>
+        <w:t xml:space="preserve">3.	</w:t>
+      </w:r>
       <w:r>
         <w:t xml:space="preserve">Every menu item must exist (else 404) </w:t>
       </w:r>
@@ -17040,12 +17109,15 @@
     </w:p>
     <w:p>
       <w:pPr>
-        <w:pStyle w:val="ListParagraph"/>
-        <w:numPr>
-          <w:ilvl w:val="0"/>
-          <w:numId w:val="7"/>
-        </w:numPr>
-      </w:pPr>
+        <w:tabs>
+          <w:tab w:val="left" w:pos="540"/>
+        </w:tabs>
+        <w:spacing w:after="60"/>
+        <w:ind w:left="540" w:hanging="300"/>
+      </w:pPr>
+      <w:r>
+        <w:t xml:space="preserve">4.	</w:t>
+      </w:r>
       <w:r>
         <w:rPr>
           <w:b/>
@@ -17059,12 +17131,15 @@
     </w:p>
     <w:p>
       <w:pPr>
-        <w:pStyle w:val="ListParagraph"/>
-        <w:numPr>
-          <w:ilvl w:val="0"/>
-          <w:numId w:val="7"/>
-        </w:numPr>
-      </w:pPr>
+        <w:tabs>
+          <w:tab w:val="left" w:pos="540"/>
+        </w:tabs>
+        <w:spacing w:after="60"/>
+        <w:ind w:left="540" w:hanging="300"/>
+      </w:pPr>
+      <w:r>
+        <w:t xml:space="preserve">5.	</w:t>
+      </w:r>
       <w:r>
         <w:rPr>
           <w:b/>
@@ -17078,12 +17153,15 @@
     </w:p>
     <w:p>
       <w:pPr>
-        <w:pStyle w:val="ListParagraph"/>
-        <w:numPr>
-          <w:ilvl w:val="0"/>
-          <w:numId w:val="7"/>
-        </w:numPr>
-      </w:pPr>
+        <w:tabs>
+          <w:tab w:val="left" w:pos="540"/>
+        </w:tabs>
+        <w:spacing w:after="60"/>
+        <w:ind w:left="540" w:hanging="300"/>
+      </w:pPr>
+      <w:r>
+        <w:t xml:space="preserve">6.	</w:t>
+      </w:r>
       <w:r>
         <w:t xml:space="preserve">Save the order. If saving fails, the seat is </w:t>
       </w:r>
@@ -17112,12 +17190,15 @@
     </w:p>
     <w:p>
       <w:pPr>
-        <w:pStyle w:val="ListParagraph"/>
-        <w:numPr>
-          <w:ilvl w:val="0"/>
-          <w:numId w:val="7"/>
-        </w:numPr>
-      </w:pPr>
+        <w:tabs>
+          <w:tab w:val="left" w:pos="540"/>
+        </w:tabs>
+        <w:spacing w:after="60"/>
+        <w:ind w:left="540" w:hanging="300"/>
+      </w:pPr>
+      <w:r>
+        <w:t xml:space="preserve">7.	</w:t>
+      </w:r>
       <w:r>
         <w:t xml:space="preserve">Return 201 with the order populated with slot and student details.</w:t>
       </w:r>
@@ -30296,6 +30377,15 @@
         <w:ind w:left="540" w:hanging="270"/>
       </w:pPr>
     </w:lvl>
+    <w:lvl w:ilvl="1" w:tentative="1">
+      <w:start w:val="1"/>
+      <w:numFmt w:val="bullet"/>
+      <w:lvlText w:val="–"/>
+      <w:lvlJc w:val="left"/>
+      <w:pPr>
+        <w:ind w:left="1000" w:hanging="270"/>
+      </w:pPr>
+    </w:lvl>
   </w:abstractNum>
   <w:abstractNum w:abstractNumId="3" w15:restartNumberingAfterBreak="0">
     <w:multiLevelType w:val="hybridMultilevel"/>
@@ -30317,36 +30407,6 @@
   </w:num>
   <w:num w:numId="2">
     <w:abstractNumId w:val="2"/>
-    <w:lvlOverride w:ilvl="0">
-      <w:startOverride w:val="1"/>
-    </w:lvlOverride>
-  </w:num>
-  <w:num w:numId="3">
-    <w:abstractNumId w:val="3"/>
-    <w:lvlOverride w:ilvl="0">
-      <w:startOverride w:val="1"/>
-    </w:lvlOverride>
-  </w:num>
-  <w:num w:numId="4">
-    <w:abstractNumId w:val="3"/>
-    <w:lvlOverride w:ilvl="0">
-      <w:startOverride w:val="1"/>
-    </w:lvlOverride>
-  </w:num>
-  <w:num w:numId="5">
-    <w:abstractNumId w:val="3"/>
-    <w:lvlOverride w:ilvl="0">
-      <w:startOverride w:val="1"/>
-    </w:lvlOverride>
-  </w:num>
-  <w:num w:numId="6">
-    <w:abstractNumId w:val="3"/>
-    <w:lvlOverride w:ilvl="0">
-      <w:startOverride w:val="1"/>
-    </w:lvlOverride>
-  </w:num>
-  <w:num w:numId="7">
-    <w:abstractNumId w:val="3"/>
     <w:lvlOverride w:ilvl="0">
       <w:startOverride w:val="1"/>
     </w:lvlOverride>

</xml_diff>